<commit_message>
compliance(Victoriabank): remove false payment claims, add support SLA + legal requisites
- /subscribe: drop "Stripe · Visa / Mastercard" and "Anulare oricând · fără
  angajamente" (no real processing / no cancellation yet) → neutral
  "Planul va fi activat de echipa noastră după verificare"
- public footer (LegalDoc): visible "© 2026 BlackSpace Tech SRL · IDNO
  1024600065567 · bd. Decebal 99D, mun. Chișinău"
- add "Răspundem în maximum 36 de ore lucrătoare." next to support email in
  source .docx (Despre, Politică de confidențialitate) + regenerated
  lib/legal-content.ts (fresh regen, byte-identical to hand edit)

Co-Authored-By: Claude Opus 4.8 <noreply@anthropic.com>
</commit_message>
<xml_diff>
--- a/docs/Politică de confidențialitate.docx
+++ b/docs/Politică de confidențialitate.docx
@@ -303,7 +303,7 @@
           <w:szCs w:val="24"/>
           <w:rtl w:val="0"/>
         </w:rPr>
-        <w:t xml:space="preserve">info@biseeth.md.</w:t>
+        <w:t xml:space="preserve">info@biseeth.md. Răspundem în maximum 36 de ore lucrătoare.</w:t>
       </w:r>
     </w:p>
     <w:p>
@@ -1064,7 +1064,7 @@
           <w:szCs w:val="24"/>
           <w:rtl w:val="0"/>
         </w:rPr>
-        <w:t xml:space="preserve">Drepturile se exercită prin cerere la info@biseeth.md</w:t>
+        <w:t xml:space="preserve">Drepturile se exercită prin cerere la info@biseeth.md. Răspundem în maximum 36 de ore lucrătoare</w:t>
       </w:r>
       <w:r>
         <w:rPr>

</xml_diff>